<commit_message>
Add complete PDF project documentation
</commit_message>
<xml_diff>
--- a/docs/FoodStack - Documentação de Projeto.docx
+++ b/docs/FoodStack - Documentação de Projeto.docx
@@ -125,7 +125,7 @@
         </w:rPr>
       </w:pPr>
       <w:r>
-        <w:t>Versão 1.1</w:t>
+        <w:t>Versão 1.0</w:t>
       </w:r>
     </w:p>
     <w:p>
@@ -231,7 +231,7 @@
         </w:sectPr>
       </w:pPr>
       <w:r>
-        <w:t>07 de junho de 2026</w:t>
+        <w:t>10 de junho de 2026</w:t>
       </w:r>
     </w:p>
     <w:p>
@@ -2309,7 +2309,7 @@
               <w:rPr>
                 <w:sz w:val="17"/>
               </w:rPr>
-              <w:t>21/06/2026</w:t>
+              <w:t>10/06/2026</w:t>
             </w:r>
           </w:p>
         </w:tc>

</xml_diff>